<commit_message>
v1.1: Segment Control text → Label/S (12 Semi Bold), height 31
- Edit Title & Subtitle: Title / Subtitle segment control now uses Label/S
  (Inter Semi Bold 12, line height 15, -1% tracking); control 288×31,
  matching the updated Bar/Segment Control component (Figma 5215:79859).
- docs/components.md: Bar/Segment Control sizes and text style updated.
- docs/YCMuse_Prototype_Update_Log.docx: new "October 20, 2026" entry.

Co-Authored-By: Claude Opus 5.5 <noreply@anthropic.com>
Claude-Session: https://claude.ai/code/session_01XM2YJD7DB1wdwk9hDtTANP
</commit_message>
<xml_diff>
--- a/docs/YCMuse_Prototype_Update_Log.docx
+++ b/docs/YCMuse_Prototype_Update_Log.docx
@@ -74,7 +74,7 @@
           <w:sz w:val="18"/>
           <w:szCs w:val="18"/>
         </w:rPr>
-        <w:t>October 19, 2026</w:t>
+        <w:t>October 20, 2026</w:t>
       </w:r>
       <w:r>
         <w:rPr>
@@ -278,6 +278,244 @@
                 <w:szCs w:val="17"/>
               </w:rPr>
               <w:t>Fix</w:t>
+            </w:r>
+          </w:p>
+        </w:tc>
+      </w:tr>
+    </w:tbl>
+    <w:p>
+      <w:pPr>
+        <w:pBdr>
+          <w:bottom w:val="single" w:sz="8" w:space="4" w:color="A855F7"/>
+        </w:pBdr>
+        <w:spacing w:before="360" w:after="120"/>
+      </w:pPr>
+      <w:r>
+        <w:rPr>
+          <w:rFonts w:ascii="Arial" w:eastAsia="Arial" w:hAnsi="Arial" w:cs="Arial"/>
+          <w:color w:val="9CA3AF"/>
+          <w:sz w:val="22"/>
+          <w:szCs w:val="22"/>
+        </w:rPr>
+        <w:t>Updates — October 20, 2026</w:t>
+      </w:r>
+    </w:p>
+    <w:tbl>
+      <w:tblPr>
+        <w:tblW w:w="10080" w:type="dxa"/>
+        <w:tblBorders>
+          <w:top w:val="single" w:sz="4" w:space="0" w:color="auto"/>
+          <w:left w:val="single" w:sz="4" w:space="0" w:color="auto"/>
+          <w:bottom w:val="single" w:sz="4" w:space="0" w:color="auto"/>
+          <w:right w:val="single" w:sz="4" w:space="0" w:color="auto"/>
+          <w:insideH w:val="single" w:sz="4" w:space="0" w:color="auto"/>
+          <w:insideV w:val="single" w:sz="4" w:space="0" w:color="auto"/>
+        </w:tblBorders>
+        <w:tblCellMar>
+          <w:left w:w="10" w:type="dxa"/>
+          <w:right w:w="10" w:type="dxa"/>
+        </w:tblCellMar>
+        <w:tblLook w:val="04A0" w:firstRow="1" w:lastRow="0" w:firstColumn="1" w:lastColumn="0" w:noHBand="0" w:noVBand="1"/>
+      </w:tblPr>
+      <w:tblGrid>
+        <w:gridCol w:w="2500"/>
+        <w:gridCol w:w="960"/>
+        <w:gridCol w:w="6620"/>
+      </w:tblGrid>
+      <w:tr>
+        <w:trPr>
+          <w:tblHeader/>
+        </w:trPr>
+        <w:tc>
+          <w:tcPr>
+            <w:tcW w:w="2500" w:type="dxa"/>
+            <w:tcBorders>
+              <w:top w:val="none" w:sz="0" w:space="0" w:color="FFFFFF"/>
+              <w:left w:val="none" w:sz="0" w:space="0" w:color="FFFFFF"/>
+              <w:bottom w:val="none" w:sz="0" w:space="0" w:color="FFFFFF"/>
+              <w:right w:val="none" w:sz="0" w:space="0" w:color="FFFFFF"/>
+            </w:tcBorders>
+            <w:shd w:val="clear" w:color="auto" w:fill="1F1535"/>
+            <w:tcMar>
+              <w:top w:w="110" w:type="dxa"/>
+              <w:left w:w="140" w:type="dxa"/>
+              <w:bottom w:w="110" w:type="dxa"/>
+              <w:right w:w="140" w:type="dxa"/>
+            </w:tcMar>
+            <w:vAlign w:val="center"/>
+          </w:tcPr>
+          <w:p>
+            <w:r>
+              <w:rPr>
+                <w:rFonts w:ascii="Arial" w:eastAsia="Arial" w:hAnsi="Arial" w:cs="Arial"/>
+                <w:b/>
+                <w:bCs/>
+                <w:color w:val="FFFFFF"/>
+                <w:sz w:val="18"/>
+                <w:szCs w:val="18"/>
+              </w:rPr>
+              <w:t>Screen / Area</w:t>
+            </w:r>
+          </w:p>
+        </w:tc>
+        <w:tc>
+          <w:tcPr>
+            <w:tcW w:w="960" w:type="dxa"/>
+            <w:tcBorders>
+              <w:top w:val="none" w:sz="0" w:space="0" w:color="FFFFFF"/>
+              <w:left w:val="none" w:sz="0" w:space="0" w:color="FFFFFF"/>
+              <w:bottom w:val="none" w:sz="0" w:space="0" w:color="FFFFFF"/>
+              <w:right w:val="none" w:sz="0" w:space="0" w:color="FFFFFF"/>
+            </w:tcBorders>
+            <w:shd w:val="clear" w:color="auto" w:fill="1F1535"/>
+            <w:tcMar>
+              <w:top w:w="110" w:type="dxa"/>
+              <w:left w:w="140" w:type="dxa"/>
+              <w:bottom w:w="110" w:type="dxa"/>
+              <w:right w:w="140" w:type="dxa"/>
+            </w:tcMar>
+            <w:vAlign w:val="center"/>
+          </w:tcPr>
+          <w:p>
+            <w:r>
+              <w:rPr>
+                <w:rFonts w:ascii="Arial" w:eastAsia="Arial" w:hAnsi="Arial" w:cs="Arial"/>
+                <w:b/>
+                <w:bCs/>
+                <w:color w:val="FFFFFF"/>
+                <w:sz w:val="18"/>
+                <w:szCs w:val="18"/>
+              </w:rPr>
+              <w:t>Type</w:t>
+            </w:r>
+          </w:p>
+        </w:tc>
+        <w:tc>
+          <w:tcPr>
+            <w:tcW w:w="6620" w:type="dxa"/>
+            <w:tcBorders>
+              <w:top w:val="none" w:sz="0" w:space="0" w:color="FFFFFF"/>
+              <w:left w:val="none" w:sz="0" w:space="0" w:color="FFFFFF"/>
+              <w:bottom w:val="none" w:sz="0" w:space="0" w:color="FFFFFF"/>
+              <w:right w:val="none" w:sz="0" w:space="0" w:color="FFFFFF"/>
+            </w:tcBorders>
+            <w:shd w:val="clear" w:color="auto" w:fill="1F1535"/>
+            <w:tcMar>
+              <w:top w:w="110" w:type="dxa"/>
+              <w:left w:w="140" w:type="dxa"/>
+              <w:bottom w:w="110" w:type="dxa"/>
+              <w:right w:w="140" w:type="dxa"/>
+            </w:tcMar>
+            <w:vAlign w:val="center"/>
+          </w:tcPr>
+          <w:p>
+            <w:r>
+              <w:rPr>
+                <w:rFonts w:ascii="Arial" w:eastAsia="Arial" w:hAnsi="Arial" w:cs="Arial"/>
+                <w:b/>
+                <w:bCs/>
+                <w:color w:val="FFFFFF"/>
+                <w:sz w:val="18"/>
+                <w:szCs w:val="18"/>
+              </w:rPr>
+              <w:t>Description</w:t>
+            </w:r>
+          </w:p>
+        </w:tc>
+      </w:tr>
+      <w:tr>
+        <w:tc>
+          <w:tcPr>
+            <w:tcW w:w="2500" w:type="dxa"/>
+            <w:tcBorders>
+              <w:top w:val="single" w:sz="1" w:space="0" w:color="E5E7EB"/>
+              <w:left w:val="single" w:sz="1" w:space="0" w:color="E5E7EB"/>
+              <w:bottom w:val="single" w:sz="1" w:space="0" w:color="E5E7EB"/>
+              <w:right w:val="single" w:sz="1" w:space="0" w:color="E5E7EB"/>
+            </w:tcBorders>
+            <w:shd w:val="clear" w:color="auto" w:fill="FAFAFA"/>
+            <w:tcMar>
+              <w:top w:w="100" w:type="dxa"/>
+              <w:left w:w="140" w:type="dxa"/>
+              <w:bottom w:w="100" w:type="dxa"/>
+              <w:right w:w="140" w:type="dxa"/>
+            </w:tcMar>
+            <w:vAlign w:val="center"/>
+          </w:tcPr>
+          <w:p>
+            <w:r>
+              <w:rPr>
+                <w:rFonts w:ascii="Arial" w:eastAsia="Arial" w:hAnsi="Arial" w:cs="Arial"/>
+                <w:color w:val="1F2937"/>
+                <w:sz w:val="18"/>
+                <w:szCs w:val="18"/>
+              </w:rPr>
+              <w:t>Edit Title &amp; Subtitle — Segment Control</w:t>
+            </w:r>
+          </w:p>
+        </w:tc>
+        <w:tc>
+          <w:tcPr>
+            <w:tcW w:w="960" w:type="dxa"/>
+            <w:tcBorders>
+              <w:top w:val="single" w:sz="1" w:space="0" w:color="E5E7EB"/>
+              <w:left w:val="single" w:sz="1" w:space="0" w:color="E5E7EB"/>
+              <w:bottom w:val="single" w:sz="1" w:space="0" w:color="E5E7EB"/>
+              <w:right w:val="single" w:sz="1" w:space="0" w:color="E5E7EB"/>
+            </w:tcBorders>
+            <w:shd w:val="clear" w:color="auto" w:fill="FEF9C3"/>
+            <w:tcMar>
+              <w:top w:w="100" w:type="dxa"/>
+              <w:left w:w="80" w:type="dxa"/>
+              <w:bottom w:w="100" w:type="dxa"/>
+              <w:right w:w="80" w:type="dxa"/>
+            </w:tcMar>
+            <w:vAlign w:val="center"/>
+          </w:tcPr>
+          <w:p>
+            <w:pPr>
+              <w:jc w:val="center"/>
+            </w:pPr>
+            <w:r>
+              <w:rPr>
+                <w:rFonts w:ascii="Arial" w:eastAsia="Arial" w:hAnsi="Arial" w:cs="Arial"/>
+                <w:b/>
+                <w:bCs/>
+                <w:color w:val="854D0E"/>
+                <w:sz w:val="17"/>
+                <w:szCs w:val="17"/>
+              </w:rPr>
+              <w:t>UI</w:t>
+            </w:r>
+          </w:p>
+        </w:tc>
+        <w:tc>
+          <w:tcPr>
+            <w:tcW w:w="6620" w:type="dxa"/>
+            <w:tcBorders>
+              <w:top w:val="single" w:sz="1" w:space="0" w:color="E5E7EB"/>
+              <w:left w:val="single" w:sz="1" w:space="0" w:color="E5E7EB"/>
+              <w:bottom w:val="single" w:sz="1" w:space="0" w:color="E5E7EB"/>
+              <w:right w:val="single" w:sz="1" w:space="0" w:color="E5E7EB"/>
+            </w:tcBorders>
+            <w:shd w:val="clear" w:color="auto" w:fill="FAFAFA"/>
+            <w:tcMar>
+              <w:top w:w="100" w:type="dxa"/>
+              <w:left w:w="140" w:type="dxa"/>
+              <w:bottom w:w="100" w:type="dxa"/>
+              <w:right w:w="140" w:type="dxa"/>
+            </w:tcMar>
+            <w:vAlign w:val="center"/>
+          </w:tcPr>
+          <w:p>
+            <w:r>
+              <w:rPr>
+                <w:rFonts w:ascii="Arial" w:eastAsia="Arial" w:hAnsi="Arial" w:cs="Arial"/>
+                <w:color w:val="4B5563"/>
+                <w:sz w:val="18"/>
+                <w:szCs w:val="18"/>
+              </w:rPr>
+              <w:t>Title / Subtitle segment control text enlarged to Label/S (Inter Semi Bold 12, line height 15) per the updated Bar/Segment Control component (Figma 5215:79859); control height 27 → 31px.</w:t>
             </w:r>
           </w:p>
         </w:tc>

</xml_diff>

<commit_message>
Content Notice (permanent): remove "What This Means" and policy/appeal links
- muse-prototype-v1-1.html: #screen-takedown-permanent now ends after the
  removal reason; bullet list and the two link rows removed.
- docs/YCMuse_Prototype_Update_Log.docx: row added to October 20, 2026.

Co-Authored-By: Claude Opus 5.5 <noreply@anthropic.com>
Claude-Session: https://claude.ai/code/session_01XM2YJD7DB1wdwk9hDtTANP
</commit_message>
<xml_diff>
--- a/docs/YCMuse_Prototype_Update_Log.docx
+++ b/docs/YCMuse_Prototype_Update_Log.docx
@@ -807,6 +807,103 @@
                 <w:szCs w:val="18"/>
               </w:rPr>
               <w:t>Aligned to the Figma UI Components page: large buttons 44px (Bold 15, no glow; disabled = #383842 + 30% text), secondary/outline → Tertiary pill, Medium pill text Semi Bold 12; toggles 44×24 (off #383842); Done / Removed badges and 8px badge blur; sheet handle + 40px bottom padding; toast 300 wide with gradient icon and pill CTAs; nav bar height 90 with 15% divider; tab bar 95% / blur 16 / Regular 9 labels; input labels white Semi Bold 12; section headers Bold 17.</w:t>
+            </w:r>
+          </w:p>
+        </w:tc>
+      </w:tr>
+      <w:tr>
+        <w:tc>
+          <w:tcPr>
+            <w:tcW w:w="2500" w:type="dxa"/>
+            <w:tcBorders>
+              <w:top w:val="single" w:sz="1" w:space="0" w:color="E5E7EB"/>
+              <w:left w:val="single" w:sz="1" w:space="0" w:color="E5E7EB"/>
+              <w:bottom w:val="single" w:sz="1" w:space="0" w:color="E5E7EB"/>
+              <w:right w:val="single" w:sz="1" w:space="0" w:color="E5E7EB"/>
+            </w:tcBorders>
+            <w:shd w:val="clear" w:color="auto" w:fill="FAFAFA"/>
+            <w:tcMar>
+              <w:top w:w="100" w:type="dxa"/>
+              <w:left w:w="140" w:type="dxa"/>
+              <w:bottom w:w="100" w:type="dxa"/>
+              <w:right w:w="140" w:type="dxa"/>
+            </w:tcMar>
+            <w:vAlign w:val="center"/>
+          </w:tcPr>
+          <w:p>
+            <w:r>
+              <w:rPr>
+                <w:rFonts w:ascii="Arial" w:eastAsia="Arial" w:hAnsi="Arial" w:cs="Arial"/>
+                <w:color w:val="1F2937"/>
+                <w:sz w:val="18"/>
+                <w:szCs w:val="18"/>
+              </w:rPr>
+              <w:t>Content Notice — Permanently Removed</w:t>
+            </w:r>
+          </w:p>
+        </w:tc>
+        <w:tc>
+          <w:tcPr>
+            <w:tcW w:w="960" w:type="dxa"/>
+            <w:tcBorders>
+              <w:top w:val="single" w:sz="1" w:space="0" w:color="E5E7EB"/>
+              <w:left w:val="single" w:sz="1" w:space="0" w:color="E5E7EB"/>
+              <w:bottom w:val="single" w:sz="1" w:space="0" w:color="E5E7EB"/>
+              <w:right w:val="single" w:sz="1" w:space="0" w:color="E5E7EB"/>
+            </w:tcBorders>
+            <w:shd w:val="clear" w:color="auto" w:fill="FEF9C3"/>
+            <w:tcMar>
+              <w:top w:w="100" w:type="dxa"/>
+              <w:left w:w="80" w:type="dxa"/>
+              <w:bottom w:w="100" w:type="dxa"/>
+              <w:right w:w="80" w:type="dxa"/>
+            </w:tcMar>
+            <w:vAlign w:val="center"/>
+          </w:tcPr>
+          <w:p>
+            <w:pPr>
+              <w:jc w:val="center"/>
+            </w:pPr>
+            <w:r>
+              <w:rPr>
+                <w:rFonts w:ascii="Arial" w:eastAsia="Arial" w:hAnsi="Arial" w:cs="Arial"/>
+                <w:b/>
+                <w:bCs/>
+                <w:color w:val="854D0E"/>
+                <w:sz w:val="17"/>
+                <w:szCs w:val="17"/>
+              </w:rPr>
+              <w:t>UI</w:t>
+            </w:r>
+          </w:p>
+        </w:tc>
+        <w:tc>
+          <w:tcPr>
+            <w:tcW w:w="6620" w:type="dxa"/>
+            <w:tcBorders>
+              <w:top w:val="single" w:sz="1" w:space="0" w:color="E5E7EB"/>
+              <w:left w:val="single" w:sz="1" w:space="0" w:color="E5E7EB"/>
+              <w:bottom w:val="single" w:sz="1" w:space="0" w:color="E5E7EB"/>
+              <w:right w:val="single" w:sz="1" w:space="0" w:color="E5E7EB"/>
+            </w:tcBorders>
+            <w:shd w:val="clear" w:color="auto" w:fill="FAFAFA"/>
+            <w:tcMar>
+              <w:top w:w="100" w:type="dxa"/>
+              <w:left w:w="140" w:type="dxa"/>
+              <w:bottom w:w="100" w:type="dxa"/>
+              <w:right w:w="140" w:type="dxa"/>
+            </w:tcMar>
+            <w:vAlign w:val="center"/>
+          </w:tcPr>
+          <w:p>
+            <w:r>
+              <w:rPr>
+                <w:rFonts w:ascii="Arial" w:eastAsia="Arial" w:hAnsi="Arial" w:cs="Arial"/>
+                <w:color w:val="4B5563"/>
+                <w:sz w:val="18"/>
+                <w:szCs w:val="18"/>
+              </w:rPr>
+              <w:t>Removed the "What This Means" bullet list and the "Learn about our content policy" / "Appeal this decision" links; the screen now ends with the removal reason and the Got It button.</w:t>
             </w:r>
           </w:p>
         </w:tc>

</xml_diff>

<commit_message>
Edit MV: new Title & Subtitle description copy
- muse-prototype-v1-1.html: "Adjust title and subtitle effects, MV title,
  author name." → "Edit the text shown in your MV and style it your way."
- docs/YCMuse_Prototype_Update_Log.docx: new "October 22, 2026" entry.

Co-Authored-By: Claude Opus 5.5 <noreply@anthropic.com>
Claude-Session: https://claude.ai/code/session_01XM2YJD7DB1wdwk9hDtTANP
</commit_message>
<xml_diff>
--- a/docs/YCMuse_Prototype_Update_Log.docx
+++ b/docs/YCMuse_Prototype_Update_Log.docx
@@ -74,7 +74,7 @@
           <w:sz w:val="18"/>
           <w:szCs w:val="18"/>
         </w:rPr>
-        <w:t>October 20, 2026</w:t>
+        <w:t>October 22, 2026</w:t>
       </w:r>
       <w:r>
         <w:rPr>
@@ -278,6 +278,244 @@
                 <w:szCs w:val="17"/>
               </w:rPr>
               <w:t>Fix</w:t>
+            </w:r>
+          </w:p>
+        </w:tc>
+      </w:tr>
+    </w:tbl>
+    <w:p>
+      <w:pPr>
+        <w:pBdr>
+          <w:bottom w:val="single" w:sz="8" w:space="4" w:color="A855F7"/>
+        </w:pBdr>
+        <w:spacing w:before="360" w:after="120"/>
+      </w:pPr>
+      <w:r>
+        <w:rPr>
+          <w:rFonts w:ascii="Arial" w:eastAsia="Arial" w:hAnsi="Arial" w:cs="Arial"/>
+          <w:color w:val="9CA3AF"/>
+          <w:sz w:val="22"/>
+          <w:szCs w:val="22"/>
+        </w:rPr>
+        <w:t>Updates — October 22, 2026</w:t>
+      </w:r>
+    </w:p>
+    <w:tbl>
+      <w:tblPr>
+        <w:tblW w:w="10080" w:type="dxa"/>
+        <w:tblBorders>
+          <w:top w:val="single" w:sz="4" w:space="0" w:color="auto"/>
+          <w:left w:val="single" w:sz="4" w:space="0" w:color="auto"/>
+          <w:bottom w:val="single" w:sz="4" w:space="0" w:color="auto"/>
+          <w:right w:val="single" w:sz="4" w:space="0" w:color="auto"/>
+          <w:insideH w:val="single" w:sz="4" w:space="0" w:color="auto"/>
+          <w:insideV w:val="single" w:sz="4" w:space="0" w:color="auto"/>
+        </w:tblBorders>
+        <w:tblCellMar>
+          <w:left w:w="10" w:type="dxa"/>
+          <w:right w:w="10" w:type="dxa"/>
+        </w:tblCellMar>
+        <w:tblLook w:val="04A0" w:firstRow="1" w:lastRow="0" w:firstColumn="1" w:lastColumn="0" w:noHBand="0" w:noVBand="1"/>
+      </w:tblPr>
+      <w:tblGrid>
+        <w:gridCol w:w="2500"/>
+        <w:gridCol w:w="960"/>
+        <w:gridCol w:w="6620"/>
+      </w:tblGrid>
+      <w:tr>
+        <w:trPr>
+          <w:tblHeader/>
+        </w:trPr>
+        <w:tc>
+          <w:tcPr>
+            <w:tcW w:w="2500" w:type="dxa"/>
+            <w:tcBorders>
+              <w:top w:val="none" w:sz="0" w:space="0" w:color="FFFFFF"/>
+              <w:left w:val="none" w:sz="0" w:space="0" w:color="FFFFFF"/>
+              <w:bottom w:val="none" w:sz="0" w:space="0" w:color="FFFFFF"/>
+              <w:right w:val="none" w:sz="0" w:space="0" w:color="FFFFFF"/>
+            </w:tcBorders>
+            <w:shd w:val="clear" w:color="auto" w:fill="1F1535"/>
+            <w:tcMar>
+              <w:top w:w="110" w:type="dxa"/>
+              <w:left w:w="140" w:type="dxa"/>
+              <w:bottom w:w="110" w:type="dxa"/>
+              <w:right w:w="140" w:type="dxa"/>
+            </w:tcMar>
+            <w:vAlign w:val="center"/>
+          </w:tcPr>
+          <w:p>
+            <w:r>
+              <w:rPr>
+                <w:rFonts w:ascii="Arial" w:eastAsia="Arial" w:hAnsi="Arial" w:cs="Arial"/>
+                <w:b/>
+                <w:bCs/>
+                <w:color w:val="FFFFFF"/>
+                <w:sz w:val="18"/>
+                <w:szCs w:val="18"/>
+              </w:rPr>
+              <w:t>Screen / Area</w:t>
+            </w:r>
+          </w:p>
+        </w:tc>
+        <w:tc>
+          <w:tcPr>
+            <w:tcW w:w="960" w:type="dxa"/>
+            <w:tcBorders>
+              <w:top w:val="none" w:sz="0" w:space="0" w:color="FFFFFF"/>
+              <w:left w:val="none" w:sz="0" w:space="0" w:color="FFFFFF"/>
+              <w:bottom w:val="none" w:sz="0" w:space="0" w:color="FFFFFF"/>
+              <w:right w:val="none" w:sz="0" w:space="0" w:color="FFFFFF"/>
+            </w:tcBorders>
+            <w:shd w:val="clear" w:color="auto" w:fill="1F1535"/>
+            <w:tcMar>
+              <w:top w:w="110" w:type="dxa"/>
+              <w:left w:w="140" w:type="dxa"/>
+              <w:bottom w:w="110" w:type="dxa"/>
+              <w:right w:w="140" w:type="dxa"/>
+            </w:tcMar>
+            <w:vAlign w:val="center"/>
+          </w:tcPr>
+          <w:p>
+            <w:r>
+              <w:rPr>
+                <w:rFonts w:ascii="Arial" w:eastAsia="Arial" w:hAnsi="Arial" w:cs="Arial"/>
+                <w:b/>
+                <w:bCs/>
+                <w:color w:val="FFFFFF"/>
+                <w:sz w:val="18"/>
+                <w:szCs w:val="18"/>
+              </w:rPr>
+              <w:t>Type</w:t>
+            </w:r>
+          </w:p>
+        </w:tc>
+        <w:tc>
+          <w:tcPr>
+            <w:tcW w:w="6620" w:type="dxa"/>
+            <w:tcBorders>
+              <w:top w:val="none" w:sz="0" w:space="0" w:color="FFFFFF"/>
+              <w:left w:val="none" w:sz="0" w:space="0" w:color="FFFFFF"/>
+              <w:bottom w:val="none" w:sz="0" w:space="0" w:color="FFFFFF"/>
+              <w:right w:val="none" w:sz="0" w:space="0" w:color="FFFFFF"/>
+            </w:tcBorders>
+            <w:shd w:val="clear" w:color="auto" w:fill="1F1535"/>
+            <w:tcMar>
+              <w:top w:w="110" w:type="dxa"/>
+              <w:left w:w="140" w:type="dxa"/>
+              <w:bottom w:w="110" w:type="dxa"/>
+              <w:right w:w="140" w:type="dxa"/>
+            </w:tcMar>
+            <w:vAlign w:val="center"/>
+          </w:tcPr>
+          <w:p>
+            <w:r>
+              <w:rPr>
+                <w:rFonts w:ascii="Arial" w:eastAsia="Arial" w:hAnsi="Arial" w:cs="Arial"/>
+                <w:b/>
+                <w:bCs/>
+                <w:color w:val="FFFFFF"/>
+                <w:sz w:val="18"/>
+                <w:szCs w:val="18"/>
+              </w:rPr>
+              <w:t>Description</w:t>
+            </w:r>
+          </w:p>
+        </w:tc>
+      </w:tr>
+      <w:tr>
+        <w:tc>
+          <w:tcPr>
+            <w:tcW w:w="2500" w:type="dxa"/>
+            <w:tcBorders>
+              <w:top w:val="single" w:sz="1" w:space="0" w:color="E5E7EB"/>
+              <w:left w:val="single" w:sz="1" w:space="0" w:color="E5E7EB"/>
+              <w:bottom w:val="single" w:sz="1" w:space="0" w:color="E5E7EB"/>
+              <w:right w:val="single" w:sz="1" w:space="0" w:color="E5E7EB"/>
+            </w:tcBorders>
+            <w:shd w:val="clear" w:color="auto" w:fill="FAFAFA"/>
+            <w:tcMar>
+              <w:top w:w="100" w:type="dxa"/>
+              <w:left w:w="140" w:type="dxa"/>
+              <w:bottom w:w="100" w:type="dxa"/>
+              <w:right w:w="140" w:type="dxa"/>
+            </w:tcMar>
+            <w:vAlign w:val="center"/>
+          </w:tcPr>
+          <w:p>
+            <w:r>
+              <w:rPr>
+                <w:rFonts w:ascii="Arial" w:eastAsia="Arial" w:hAnsi="Arial" w:cs="Arial"/>
+                <w:color w:val="1F2937"/>
+                <w:sz w:val="18"/>
+                <w:szCs w:val="18"/>
+              </w:rPr>
+              <w:t>Edit MV — Title &amp; Subtitle</w:t>
+            </w:r>
+          </w:p>
+        </w:tc>
+        <w:tc>
+          <w:tcPr>
+            <w:tcW w:w="960" w:type="dxa"/>
+            <w:tcBorders>
+              <w:top w:val="single" w:sz="1" w:space="0" w:color="E5E7EB"/>
+              <w:left w:val="single" w:sz="1" w:space="0" w:color="E5E7EB"/>
+              <w:bottom w:val="single" w:sz="1" w:space="0" w:color="E5E7EB"/>
+              <w:right w:val="single" w:sz="1" w:space="0" w:color="E5E7EB"/>
+            </w:tcBorders>
+            <w:shd w:val="clear" w:color="auto" w:fill="DBEAFE"/>
+            <w:tcMar>
+              <w:top w:w="100" w:type="dxa"/>
+              <w:left w:w="80" w:type="dxa"/>
+              <w:bottom w:w="100" w:type="dxa"/>
+              <w:right w:w="80" w:type="dxa"/>
+            </w:tcMar>
+            <w:vAlign w:val="center"/>
+          </w:tcPr>
+          <w:p>
+            <w:pPr>
+              <w:jc w:val="center"/>
+            </w:pPr>
+            <w:r>
+              <w:rPr>
+                <w:rFonts w:ascii="Arial" w:eastAsia="Arial" w:hAnsi="Arial" w:cs="Arial"/>
+                <w:b/>
+                <w:bCs/>
+                <w:color w:val="1D4ED8"/>
+                <w:sz w:val="17"/>
+                <w:szCs w:val="17"/>
+              </w:rPr>
+              <w:t>UX</w:t>
+            </w:r>
+          </w:p>
+        </w:tc>
+        <w:tc>
+          <w:tcPr>
+            <w:tcW w:w="6620" w:type="dxa"/>
+            <w:tcBorders>
+              <w:top w:val="single" w:sz="1" w:space="0" w:color="E5E7EB"/>
+              <w:left w:val="single" w:sz="1" w:space="0" w:color="E5E7EB"/>
+              <w:bottom w:val="single" w:sz="1" w:space="0" w:color="E5E7EB"/>
+              <w:right w:val="single" w:sz="1" w:space="0" w:color="E5E7EB"/>
+            </w:tcBorders>
+            <w:shd w:val="clear" w:color="auto" w:fill="FAFAFA"/>
+            <w:tcMar>
+              <w:top w:w="100" w:type="dxa"/>
+              <w:left w:w="140" w:type="dxa"/>
+              <w:bottom w:w="100" w:type="dxa"/>
+              <w:right w:w="140" w:type="dxa"/>
+            </w:tcMar>
+            <w:vAlign w:val="center"/>
+          </w:tcPr>
+          <w:p>
+            <w:r>
+              <w:rPr>
+                <w:rFonts w:ascii="Arial" w:eastAsia="Arial" w:hAnsi="Arial" w:cs="Arial"/>
+                <w:color w:val="4B5563"/>
+                <w:sz w:val="18"/>
+                <w:szCs w:val="18"/>
+              </w:rPr>
+              <w:t>Description copy changed to "Edit the text shown in your MV and style it your way."</w:t>
             </w:r>
           </w:p>
         </w:tc>

</xml_diff>

<commit_message>
Report sheet: "Something else" free-text step; report icon back to 100%
- muse-prototype-v1-1.html:
  - .rpt-icon-btn icon opacity restored to 100% (MV + Song).
  - New "Something else" row → second step per Figma 5375:179009:
    divider, back button, guidance copy, Details input (maxlength 1000,
    counter, X clear button when typed), Submit Report enabled once text
    is entered. Sheet height locked to the reason-list height while in
    this step so the keyboard doesn't reflow it.
- docs/YCMuse_Prototype_Update_Log.docx: 2 rows added to October 22, 2026.

Co-Authored-By: Claude Opus 5.5 <noreply@anthropic.com>
Claude-Session: https://claude.ai/code/session_01XM2YJD7DB1wdwk9hDtTANP
</commit_message>
<xml_diff>
--- a/docs/YCMuse_Prototype_Update_Log.docx
+++ b/docs/YCMuse_Prototype_Update_Log.docx
@@ -516,6 +516,200 @@
                 <w:szCs w:val="18"/>
               </w:rPr>
               <w:t>Description copy changed to "Edit the text shown in your MV and style it your way."</w:t>
+            </w:r>
+          </w:p>
+        </w:tc>
+      </w:tr>
+      <w:tr>
+        <w:tc>
+          <w:tcPr>
+            <w:tcW w:w="2500" w:type="dxa"/>
+            <w:tcBorders>
+              <w:top w:val="single" w:sz="1" w:space="0" w:color="E5E7EB"/>
+              <w:left w:val="single" w:sz="1" w:space="0" w:color="E5E7EB"/>
+              <w:bottom w:val="single" w:sz="1" w:space="0" w:color="E5E7EB"/>
+              <w:right w:val="single" w:sz="1" w:space="0" w:color="E5E7EB"/>
+            </w:tcBorders>
+            <w:shd w:val="clear" w:color="auto" w:fill="FAFAFA"/>
+            <w:tcMar>
+              <w:top w:w="100" w:type="dxa"/>
+              <w:left w:w="140" w:type="dxa"/>
+              <w:bottom w:w="100" w:type="dxa"/>
+              <w:right w:w="140" w:type="dxa"/>
+            </w:tcMar>
+            <w:vAlign w:val="center"/>
+          </w:tcPr>
+          <w:p>
+            <w:r>
+              <w:rPr>
+                <w:rFonts w:ascii="Arial" w:eastAsia="Arial" w:hAnsi="Arial" w:cs="Arial"/>
+                <w:color w:val="1F2937"/>
+                <w:sz w:val="18"/>
+                <w:szCs w:val="18"/>
+              </w:rPr>
+              <w:t>MV Preview &amp; Song Player — Report Button</w:t>
+            </w:r>
+          </w:p>
+        </w:tc>
+        <w:tc>
+          <w:tcPr>
+            <w:tcW w:w="960" w:type="dxa"/>
+            <w:tcBorders>
+              <w:top w:val="single" w:sz="1" w:space="0" w:color="E5E7EB"/>
+              <w:left w:val="single" w:sz="1" w:space="0" w:color="E5E7EB"/>
+              <w:bottom w:val="single" w:sz="1" w:space="0" w:color="E5E7EB"/>
+              <w:right w:val="single" w:sz="1" w:space="0" w:color="E5E7EB"/>
+            </w:tcBorders>
+            <w:shd w:val="clear" w:color="auto" w:fill="FEF9C3"/>
+            <w:tcMar>
+              <w:top w:w="100" w:type="dxa"/>
+              <w:left w:w="80" w:type="dxa"/>
+              <w:bottom w:w="100" w:type="dxa"/>
+              <w:right w:w="80" w:type="dxa"/>
+            </w:tcMar>
+            <w:vAlign w:val="center"/>
+          </w:tcPr>
+          <w:p>
+            <w:pPr>
+              <w:jc w:val="center"/>
+            </w:pPr>
+            <w:r>
+              <w:rPr>
+                <w:rFonts w:ascii="Arial" w:eastAsia="Arial" w:hAnsi="Arial" w:cs="Arial"/>
+                <w:b/>
+                <w:bCs/>
+                <w:color w:val="854D0E"/>
+                <w:sz w:val="17"/>
+                <w:szCs w:val="17"/>
+              </w:rPr>
+              <w:t>UI</w:t>
+            </w:r>
+          </w:p>
+        </w:tc>
+        <w:tc>
+          <w:tcPr>
+            <w:tcW w:w="6620" w:type="dxa"/>
+            <w:tcBorders>
+              <w:top w:val="single" w:sz="1" w:space="0" w:color="E5E7EB"/>
+              <w:left w:val="single" w:sz="1" w:space="0" w:color="E5E7EB"/>
+              <w:bottom w:val="single" w:sz="1" w:space="0" w:color="E5E7EB"/>
+              <w:right w:val="single" w:sz="1" w:space="0" w:color="E5E7EB"/>
+            </w:tcBorders>
+            <w:shd w:val="clear" w:color="auto" w:fill="FAFAFA"/>
+            <w:tcMar>
+              <w:top w:w="100" w:type="dxa"/>
+              <w:left w:w="140" w:type="dxa"/>
+              <w:bottom w:w="100" w:type="dxa"/>
+              <w:right w:w="140" w:type="dxa"/>
+            </w:tcMar>
+            <w:vAlign w:val="center"/>
+          </w:tcPr>
+          <w:p>
+            <w:r>
+              <w:rPr>
+                <w:rFonts w:ascii="Arial" w:eastAsia="Arial" w:hAnsi="Arial" w:cs="Arial"/>
+                <w:color w:val="4B5563"/>
+                <w:sz w:val="18"/>
+                <w:szCs w:val="18"/>
+              </w:rPr>
+              <w:t>Report (flag) icon opacity restored from 40% to 100%.</w:t>
+            </w:r>
+          </w:p>
+        </w:tc>
+      </w:tr>
+      <w:tr>
+        <w:tc>
+          <w:tcPr>
+            <w:tcW w:w="2500" w:type="dxa"/>
+            <w:tcBorders>
+              <w:top w:val="single" w:sz="1" w:space="0" w:color="E5E7EB"/>
+              <w:left w:val="single" w:sz="1" w:space="0" w:color="E5E7EB"/>
+              <w:bottom w:val="single" w:sz="1" w:space="0" w:color="E5E7EB"/>
+              <w:right w:val="single" w:sz="1" w:space="0" w:color="E5E7EB"/>
+            </w:tcBorders>
+            <w:shd w:val="clear" w:color="auto" w:fill="FAFAFA"/>
+            <w:tcMar>
+              <w:top w:w="100" w:type="dxa"/>
+              <w:left w:w="140" w:type="dxa"/>
+              <w:bottom w:w="100" w:type="dxa"/>
+              <w:right w:w="140" w:type="dxa"/>
+            </w:tcMar>
+            <w:vAlign w:val="center"/>
+          </w:tcPr>
+          <w:p>
+            <w:r>
+              <w:rPr>
+                <w:rFonts w:ascii="Arial" w:eastAsia="Arial" w:hAnsi="Arial" w:cs="Arial"/>
+                <w:color w:val="1F2937"/>
+                <w:sz w:val="18"/>
+                <w:szCs w:val="18"/>
+              </w:rPr>
+              <w:t>Report Sheet — Something else</w:t>
+            </w:r>
+          </w:p>
+        </w:tc>
+        <w:tc>
+          <w:tcPr>
+            <w:tcW w:w="960" w:type="dxa"/>
+            <w:tcBorders>
+              <w:top w:val="single" w:sz="1" w:space="0" w:color="E5E7EB"/>
+              <w:left w:val="single" w:sz="1" w:space="0" w:color="E5E7EB"/>
+              <w:bottom w:val="single" w:sz="1" w:space="0" w:color="E5E7EB"/>
+              <w:right w:val="single" w:sz="1" w:space="0" w:color="E5E7EB"/>
+            </w:tcBorders>
+            <w:shd w:val="clear" w:color="auto" w:fill="EDE9FE"/>
+            <w:tcMar>
+              <w:top w:w="100" w:type="dxa"/>
+              <w:left w:w="80" w:type="dxa"/>
+              <w:bottom w:w="100" w:type="dxa"/>
+              <w:right w:w="80" w:type="dxa"/>
+            </w:tcMar>
+            <w:vAlign w:val="center"/>
+          </w:tcPr>
+          <w:p>
+            <w:pPr>
+              <w:jc w:val="center"/>
+            </w:pPr>
+            <w:r>
+              <w:rPr>
+                <w:rFonts w:ascii="Arial" w:eastAsia="Arial" w:hAnsi="Arial" w:cs="Arial"/>
+                <w:b/>
+                <w:bCs/>
+                <w:color w:val="5B21B6"/>
+                <w:sz w:val="17"/>
+                <w:szCs w:val="17"/>
+              </w:rPr>
+              <w:t>Feature</w:t>
+            </w:r>
+          </w:p>
+        </w:tc>
+        <w:tc>
+          <w:tcPr>
+            <w:tcW w:w="6620" w:type="dxa"/>
+            <w:tcBorders>
+              <w:top w:val="single" w:sz="1" w:space="0" w:color="E5E7EB"/>
+              <w:left w:val="single" w:sz="1" w:space="0" w:color="E5E7EB"/>
+              <w:bottom w:val="single" w:sz="1" w:space="0" w:color="E5E7EB"/>
+              <w:right w:val="single" w:sz="1" w:space="0" w:color="E5E7EB"/>
+            </w:tcBorders>
+            <w:shd w:val="clear" w:color="auto" w:fill="FAFAFA"/>
+            <w:tcMar>
+              <w:top w:w="100" w:type="dxa"/>
+              <w:left w:w="140" w:type="dxa"/>
+              <w:bottom w:w="100" w:type="dxa"/>
+              <w:right w:w="140" w:type="dxa"/>
+            </w:tcMar>
+            <w:vAlign w:val="center"/>
+          </w:tcPr>
+          <w:p>
+            <w:r>
+              <w:rPr>
+                <w:rFonts w:ascii="Arial" w:eastAsia="Arial" w:hAnsi="Arial" w:cs="Arial"/>
+                <w:color w:val="4B5563"/>
+                <w:sz w:val="18"/>
+                <w:szCs w:val="18"/>
+              </w:rPr>
+              <w:t>New "Something else" option (chevron row) opens a second step: back button, guidance "Share as much detail as you can. Don’t include personal or sensitive info.", a Details input (max 1000 characters, live counter, X clear button once text is entered) and Submit Report, which works directly from this step. The sheet keeps the same height as the reason list so the keyboard opens over a stable layout (Figma 5375:179009).</w:t>
             </w:r>
           </w:p>
         </w:tc>

</xml_diff>